<commit_message>
Update manuals, .gitignore, deploy helper, and ignore venv/pycache
</commit_message>
<xml_diff>
--- a/Веб_Портал_Админ_Умумий_Йўриқномаси.docx
+++ b/Веб_Портал_Админ_Умумий_Йўриқномаси.docx
@@ -13,7 +13,7 @@
           <w:color w:val="003366"/>
           <w:sz w:val="36"/>
         </w:rPr>
-        <w:t>Зафаробод тумани маориф бўлими ягона веб-порталидан фойдаланиш бўйича умумий йўриқнома</w:t>
+        <w:t>Веб-Портал: Йўриқномаи умумий барои Администратор ва Маориф мудири</w:t>
       </w:r>
     </w:p>
     <w:p>
@@ -27,7 +27,7 @@
           <w:color w:val="003366"/>
           <w:sz w:val="36"/>
         </w:rPr>
-        <w:t>(Администратор ва Маориф мудири учун)</w:t>
+        <w:t>(Зафаробод тумани, ягона портали маориф)</w:t>
       </w:r>
     </w:p>
     <w:p>
@@ -37,21 +37,21 @@
           <w:b w:val="0"/>
           <w:sz w:val="22"/>
         </w:rPr>
-        <w:t>Ушбу йўриқнома Зафаробод тумани маориф бўлимининг ягона веб-порталини бошқариш, созлаш ва хавфсиз ишлатиш учун тайёрланди. Унда сервер ҳақидаги малумотлар, администраторлик ваколатлари ва GitHub Desktop орқали захиралаш кўрсатмалари келтирилган.</w:t>
+        <w:t>Ушбу йўриқнома Зафаробод туманидаги маориф бўлимининг ягона веб-порталини бошқариш, созлаш ва хавфсиз ишлатиш учун тайёрланди. Унда техник тузилма, администраторлик ваколатлари, GitHub Desktop ва автоматик деплой воситалари ҳақида батафсил маълумот берилган.</w:t>
       </w:r>
     </w:p>
     <w:p>
       <w:pPr>
-        <w:pStyle w:val="Heading2"/>
+        <w:pStyle w:val="Heading1"/>
       </w:pPr>
       <w:r>
         <w:rPr>
           <w:rFonts w:ascii="Calibri" w:hAnsi="Calibri"/>
           <w:b/>
           <w:color w:val="003366"/>
-          <w:sz w:val="28"/>
+          <w:sz w:val="32"/>
         </w:rPr>
-        <w:t>1. Сервер созламалари</w:t>
+        <w:t>1. Сервер ва лойиҳа тузилмаси</w:t>
       </w:r>
     </w:p>
     <w:p>
@@ -61,7 +61,7 @@
           <w:b w:val="0"/>
           <w:sz w:val="22"/>
         </w:rPr>
-        <w:t>Лойиҳа қайси каталогда жойлашганлигини ва асосий бошқарув буйруқларини биласиз:</w:t>
+        <w:t>Портал Linux серверда, Gunicorn + Nginx технологиялари ёрдамида ишлайди. Маълумотлар базаси SQLite (db.sqlite3) шаклида сақланади.</w:t>
       </w:r>
     </w:p>
     <w:p>
@@ -74,7 +74,7 @@
           <w:b w:val="0"/>
           <w:sz w:val="22"/>
         </w:rPr>
-        <w:t>Лойиҳа каталоги: D:\Loihalar\Maorif_Portal</w:t>
+        <w:t>Маҳаллий ишлаб чиқиш каталоги: D:/Loihalar/Maorif_Portal</w:t>
       </w:r>
     </w:p>
     <w:p>
@@ -87,7 +87,7 @@
           <w:b w:val="0"/>
           <w:sz w:val="22"/>
         </w:rPr>
-        <w:t>Маҳаллий ишлаб чиқиш серверини ишга тушириш: .\venv\Scripts\python manage.py runserver</w:t>
+        <w:t>Ишлаб чиқиш мухити: Python 3.12 + Django 4.2</w:t>
       </w:r>
     </w:p>
     <w:p>
@@ -100,7 +100,7 @@
           <w:b w:val="0"/>
           <w:sz w:val="22"/>
         </w:rPr>
-        <w:t>Миграцияларни яратиш: .\venv\Scripts\python manage.py makemigrations</w:t>
+        <w:t>Продакшн сервер: 169.58.154.191</w:t>
       </w:r>
     </w:p>
     <w:p>
@@ -113,7 +113,7 @@
           <w:b w:val="0"/>
           <w:sz w:val="22"/>
         </w:rPr>
-        <w:t>Миграцияларни қўллаш: .\venv\Scripts\python manage.py migrate</w:t>
+        <w:t>Продакшн каталог: /var/www/maorif_zafarobod/</w:t>
       </w:r>
     </w:p>
     <w:p>
@@ -126,7 +126,59 @@
           <w:b w:val="0"/>
           <w:sz w:val="22"/>
         </w:rPr>
-        <w:t>Админ панелга кириш: /admin/</w:t>
+        <w:t>Продакшн лойиҳа: /var/www/maorif_zafarobod/maorif_portal/</w:t>
+      </w:r>
+    </w:p>
+    <w:p>
+      <w:pPr>
+        <w:pStyle w:val="ListBullet"/>
+      </w:pPr>
+      <w:r>
+        <w:rPr>
+          <w:rFonts w:ascii="Calibri" w:hAnsi="Calibri"/>
+          <w:b w:val="0"/>
+          <w:sz w:val="22"/>
+        </w:rPr>
+        <w:t>Gunicorn: /var/www/maorif_zafarobod/venv/bin/gunicorn</w:t>
+      </w:r>
+    </w:p>
+    <w:p>
+      <w:pPr>
+        <w:pStyle w:val="ListBullet"/>
+      </w:pPr>
+      <w:r>
+        <w:rPr>
+          <w:rFonts w:ascii="Calibri" w:hAnsi="Calibri"/>
+          <w:b w:val="0"/>
+          <w:sz w:val="22"/>
+        </w:rPr>
+        <w:t>Nginx конфигурацияси: /etc/nginx/sites-available/maorif</w:t>
+      </w:r>
+    </w:p>
+    <w:p>
+      <w:pPr>
+        <w:pStyle w:val="ListBullet"/>
+      </w:pPr>
+      <w:r>
+        <w:rPr>
+          <w:rFonts w:ascii="Calibri" w:hAnsi="Calibri"/>
+          <w:b w:val="0"/>
+          <w:sz w:val="22"/>
+        </w:rPr>
+        <w:t>База: /var/www/maorif_zafarobod/db.sqlite3</w:t>
+      </w:r>
+    </w:p>
+    <w:p>
+      <w:pPr>
+        <w:pStyle w:val="ListBullet"/>
+      </w:pPr>
+      <w:r>
+        <w:rPr>
+          <w:rFonts w:ascii="Calibri" w:hAnsi="Calibri"/>
+          <w:b w:val="0"/>
+          <w:sz w:val="22"/>
+        </w:rPr>
+        <w:t>Захира нусхалари: /root/maorif_backups_&lt;sana&gt;</w:t>
       </w:r>
     </w:p>
     <w:tbl>
@@ -153,7 +205,7 @@
                 <w:color w:val="FFFFFF"/>
                 <w:sz w:val="22"/>
               </w:rPr>
-              <w:t>Буйруқ</w:t>
+              <w:t>Амал</w:t>
             </w:r>
           </w:p>
         </w:tc>
@@ -170,7 +222,7 @@
                 <w:color w:val="FFFFFF"/>
                 <w:sz w:val="22"/>
               </w:rPr>
-              <w:t>Маъноси</w:t>
+              <w:t>Буйруқ</w:t>
             </w:r>
           </w:p>
         </w:tc>
@@ -187,7 +239,7 @@
                 <w:b w:val="0"/>
                 <w:sz w:val="22"/>
               </w:rPr>
-              <w:t>python manage.py check</w:t>
+              <w:t>Тизимни текшириш</w:t>
             </w:r>
           </w:p>
         </w:tc>
@@ -202,7 +254,7 @@
                 <w:b w:val="0"/>
                 <w:sz w:val="22"/>
               </w:rPr>
-              <w:t>Тизим соғлигини текшириш</w:t>
+              <w:t>python manage.py check</w:t>
             </w:r>
           </w:p>
         </w:tc>
@@ -219,7 +271,7 @@
                 <w:b w:val="0"/>
                 <w:sz w:val="22"/>
               </w:rPr>
-              <w:t>python manage.py makemigrations</w:t>
+              <w:t>Миграцияларни яратиш</w:t>
             </w:r>
           </w:p>
         </w:tc>
@@ -234,7 +286,7 @@
                 <w:b w:val="0"/>
                 <w:sz w:val="22"/>
               </w:rPr>
-              <w:t>Янги миграцияларни яратиш</w:t>
+              <w:t>python manage.py makemigrations</w:t>
             </w:r>
           </w:p>
         </w:tc>
@@ -251,7 +303,7 @@
                 <w:b w:val="0"/>
                 <w:sz w:val="22"/>
               </w:rPr>
-              <w:t>python manage.py migrate</w:t>
+              <w:t>Миграцияларни қўллаш</w:t>
             </w:r>
           </w:p>
         </w:tc>
@@ -266,7 +318,7 @@
                 <w:b w:val="0"/>
                 <w:sz w:val="22"/>
               </w:rPr>
-              <w:t>Миграцияларни базага қўллаш</w:t>
+              <w:t>python manage.py migrate</w:t>
             </w:r>
           </w:p>
         </w:tc>
@@ -283,7 +335,7 @@
                 <w:b w:val="0"/>
                 <w:sz w:val="22"/>
               </w:rPr>
-              <w:t>python manage.py runserver</w:t>
+              <w:t>Статик файлларни йиғиш</w:t>
             </w:r>
           </w:p>
         </w:tc>
@@ -298,7 +350,39 @@
                 <w:b w:val="0"/>
                 <w:sz w:val="22"/>
               </w:rPr>
-              <w:t>Маҳаллий серверни ишга тушириш</w:t>
+              <w:t>python manage.py collectstatic --noinput</w:t>
+            </w:r>
+          </w:p>
+        </w:tc>
+      </w:tr>
+      <w:tr>
+        <w:tc>
+          <w:tcPr>
+            <w:tcW w:type="dxa" w:w="4320"/>
+          </w:tcPr>
+          <w:p>
+            <w:r>
+              <w:rPr>
+                <w:rFonts w:ascii="Calibri" w:hAnsi="Calibri"/>
+                <w:b w:val="0"/>
+                <w:sz w:val="22"/>
+              </w:rPr>
+              <w:t>Серверни ишга тушириш</w:t>
+            </w:r>
+          </w:p>
+        </w:tc>
+        <w:tc>
+          <w:tcPr>
+            <w:tcW w:type="dxa" w:w="4320"/>
+          </w:tcPr>
+          <w:p>
+            <w:r>
+              <w:rPr>
+                <w:rFonts w:ascii="Calibri" w:hAnsi="Calibri"/>
+                <w:b w:val="0"/>
+                <w:sz w:val="22"/>
+              </w:rPr>
+              <w:t>.\venv\Scripts\python manage.py runserver</w:t>
             </w:r>
           </w:p>
         </w:tc>
@@ -338,7 +422,7 @@
                 <w:b w:val="0"/>
                 <w:sz w:val="22"/>
               </w:rPr>
-              <w:t>Серверни янгилашдан аввал `.venv\pyvenv.cfg` файлини текширинг. Агар `python.exe` манзили ўзгарган бўлса, уни тўғрилаб, венвни янгидан фаоллаштиринг.</w:t>
+              <w:t>Продакшн серверда энг охирги ўзгартиришларни қайта ишга тушириш учун Gunicorn ва Nginx-ни қайта ишга тушириш тавсия этилади.</w:t>
             </w:r>
           </w:p>
         </w:tc>
@@ -347,16 +431,16 @@
     <w:p/>
     <w:p>
       <w:pPr>
-        <w:pStyle w:val="Heading2"/>
+        <w:pStyle w:val="Heading1"/>
       </w:pPr>
       <w:r>
         <w:rPr>
           <w:rFonts w:ascii="Calibri" w:hAnsi="Calibri"/>
           <w:b/>
           <w:color w:val="003366"/>
-          <w:sz w:val="28"/>
+          <w:sz w:val="32"/>
         </w:rPr>
-        <w:t>2. Маориф мудири ваколатлари</w:t>
+        <w:t>2. Маориф мудири учун умумий метрикалар</w:t>
       </w:r>
     </w:p>
     <w:p>
@@ -366,7 +450,7 @@
           <w:b w:val="0"/>
           <w:sz w:val="22"/>
         </w:rPr>
-        <w:t>Маориф бўлими мудири порталда умумий рейтинг ва статистикаларни кўриши мумкин:</w:t>
+        <w:t>Маориф бўлими мудири порталда умумий рейтинг ва статистикаларни кўриши мумкин. Ҳозирда портал 31 та муассисани бирлаштиради.</w:t>
       </w:r>
     </w:p>
     <w:p>
@@ -392,7 +476,7 @@
           <w:b w:val="0"/>
           <w:sz w:val="22"/>
         </w:rPr>
-        <w:t>Рейтинги муассисаҳо: ҳар бир мактабнинг холҳои миёнаи ғайрирасмӣ.</w:t>
+        <w:t>Рейтинги муассисаҳо: ҳар бир мактабнинг холлари миёна.</w:t>
       </w:r>
     </w:p>
     <w:p>
@@ -431,9 +515,185 @@
           <w:b w:val="0"/>
           <w:sz w:val="22"/>
         </w:rPr>
-        <w:t>Маориф мудири бутун ноҳия миқёсидаги маълумотларни филтр ва кузатиш имкониятига эга.</w:t>
+        <w:t>Таносуби омӯзгор ба хонанда ҳисобланиб, панелда кўрсатилади.</w:t>
       </w:r>
     </w:p>
+    <w:tbl>
+      <w:tblPr>
+        <w:tblStyle w:val="TableGrid"/>
+        <w:tblW w:type="auto" w:w="0"/>
+        <w:tblLook w:firstColumn="1" w:firstRow="1" w:lastColumn="0" w:lastRow="0" w:noHBand="0" w:noVBand="1" w:val="04A0"/>
+      </w:tblPr>
+      <w:tblGrid>
+        <w:gridCol w:w="4320"/>
+        <w:gridCol w:w="4320"/>
+      </w:tblGrid>
+      <w:tr>
+        <w:tc>
+          <w:tcPr>
+            <w:tcW w:type="dxa" w:w="4320"/>
+            <w:shd w:fill="003366"/>
+          </w:tcPr>
+          <w:p>
+            <w:r>
+              <w:rPr>
+                <w:rFonts w:ascii="Calibri" w:hAnsi="Calibri"/>
+                <w:b/>
+                <w:color w:val="FFFFFF"/>
+                <w:sz w:val="22"/>
+              </w:rPr>
+              <w:t>Кўрсаткич</w:t>
+            </w:r>
+          </w:p>
+        </w:tc>
+        <w:tc>
+          <w:tcPr>
+            <w:tcW w:type="dxa" w:w="4320"/>
+            <w:shd w:fill="003366"/>
+          </w:tcPr>
+          <w:p>
+            <w:r>
+              <w:rPr>
+                <w:rFonts w:ascii="Calibri" w:hAnsi="Calibri"/>
+                <w:b/>
+                <w:color w:val="FFFFFF"/>
+                <w:sz w:val="22"/>
+              </w:rPr>
+              <w:t>Маъноси</w:t>
+            </w:r>
+          </w:p>
+        </w:tc>
+      </w:tr>
+      <w:tr>
+        <w:tc>
+          <w:tcPr>
+            <w:tcW w:type="dxa" w:w="4320"/>
+          </w:tcPr>
+          <w:p>
+            <w:r>
+              <w:rPr>
+                <w:rFonts w:ascii="Calibri" w:hAnsi="Calibri"/>
+                <w:b w:val="0"/>
+                <w:sz w:val="22"/>
+              </w:rPr>
+              <w:t>Муассисаҳо</w:t>
+            </w:r>
+          </w:p>
+        </w:tc>
+        <w:tc>
+          <w:tcPr>
+            <w:tcW w:type="dxa" w:w="4320"/>
+          </w:tcPr>
+          <w:p>
+            <w:r>
+              <w:rPr>
+                <w:rFonts w:ascii="Calibri" w:hAnsi="Calibri"/>
+                <w:b w:val="0"/>
+                <w:sz w:val="22"/>
+              </w:rPr>
+              <w:t>Тумандаги умумий мактаб / литсей / томактаб миқдори</w:t>
+            </w:r>
+          </w:p>
+        </w:tc>
+      </w:tr>
+      <w:tr>
+        <w:tc>
+          <w:tcPr>
+            <w:tcW w:type="dxa" w:w="4320"/>
+          </w:tcPr>
+          <w:p>
+            <w:r>
+              <w:rPr>
+                <w:rFonts w:ascii="Calibri" w:hAnsi="Calibri"/>
+                <w:b w:val="0"/>
+                <w:sz w:val="22"/>
+              </w:rPr>
+              <w:t>Хонандагон</w:t>
+            </w:r>
+          </w:p>
+        </w:tc>
+        <w:tc>
+          <w:tcPr>
+            <w:tcW w:type="dxa" w:w="4320"/>
+          </w:tcPr>
+          <w:p>
+            <w:r>
+              <w:rPr>
+                <w:rFonts w:ascii="Calibri" w:hAnsi="Calibri"/>
+                <w:b w:val="0"/>
+                <w:sz w:val="22"/>
+              </w:rPr>
+              <w:t>Барча муассисалардаги умумий хонанда сони</w:t>
+            </w:r>
+          </w:p>
+        </w:tc>
+      </w:tr>
+      <w:tr>
+        <w:tc>
+          <w:tcPr>
+            <w:tcW w:type="dxa" w:w="4320"/>
+          </w:tcPr>
+          <w:p>
+            <w:r>
+              <w:rPr>
+                <w:rFonts w:ascii="Calibri" w:hAnsi="Calibri"/>
+                <w:b w:val="0"/>
+                <w:sz w:val="22"/>
+              </w:rPr>
+              <w:t>Кормандон</w:t>
+            </w:r>
+          </w:p>
+        </w:tc>
+        <w:tc>
+          <w:tcPr>
+            <w:tcW w:type="dxa" w:w="4320"/>
+          </w:tcPr>
+          <w:p>
+            <w:r>
+              <w:rPr>
+                <w:rFonts w:ascii="Calibri" w:hAnsi="Calibri"/>
+                <w:b w:val="0"/>
+                <w:sz w:val="22"/>
+              </w:rPr>
+              <w:t>Омӯзгор ва кадрлар сони</w:t>
+            </w:r>
+          </w:p>
+        </w:tc>
+      </w:tr>
+      <w:tr>
+        <w:tc>
+          <w:tcPr>
+            <w:tcW w:type="dxa" w:w="4320"/>
+          </w:tcPr>
+          <w:p>
+            <w:r>
+              <w:rPr>
+                <w:rFonts w:ascii="Calibri" w:hAnsi="Calibri"/>
+                <w:b w:val="0"/>
+                <w:sz w:val="22"/>
+              </w:rPr>
+              <w:t>Таносуб</w:t>
+            </w:r>
+          </w:p>
+        </w:tc>
+        <w:tc>
+          <w:tcPr>
+            <w:tcW w:type="dxa" w:w="4320"/>
+          </w:tcPr>
+          <w:p>
+            <w:r>
+              <w:rPr>
+                <w:rFonts w:ascii="Calibri" w:hAnsi="Calibri"/>
+                <w:b w:val="0"/>
+                <w:sz w:val="22"/>
+              </w:rPr>
+              <w:t>Хонанда / омӯзгор нисбати</w:t>
+            </w:r>
+          </w:p>
+        </w:tc>
+      </w:tr>
+    </w:tbl>
+    <w:p/>
     <w:tbl>
       <w:tblPr>
         <w:tblW w:type="auto" w:w="0"/>
@@ -476,14 +736,14 @@
     <w:p/>
     <w:p>
       <w:pPr>
-        <w:pStyle w:val="Heading2"/>
+        <w:pStyle w:val="Heading1"/>
       </w:pPr>
       <w:r>
         <w:rPr>
           <w:rFonts w:ascii="Calibri" w:hAnsi="Calibri"/>
           <w:b/>
           <w:color w:val="003366"/>
-          <w:sz w:val="28"/>
+          <w:sz w:val="32"/>
         </w:rPr>
         <w:t>3. Администраторлик ваколатлари ва Админ Панел</w:t>
       </w:r>
@@ -495,12 +755,12 @@
           <w:b w:val="0"/>
           <w:sz w:val="22"/>
         </w:rPr>
-        <w:t>Портални техник ривожлантирувчи ва администратор Оҳсар Дӯсарович бошқариб туриши лозим. Унинг асосий вазифалари:</w:t>
+        <w:t>Портални техник ривожлантирувчи ва администратор Оҳсар Дӯсарович бошқариб туриши лозим. Админ панел орқали коди ёзмасдан ҳамма маълумотларни бошқариш мумкин.</w:t>
       </w:r>
     </w:p>
     <w:p>
       <w:pPr>
-        <w:pStyle w:val="ListBullet"/>
+        <w:pStyle w:val="ListNumber"/>
       </w:pPr>
       <w:r>
         <w:rPr>
@@ -513,7 +773,7 @@
     </w:p>
     <w:p>
       <w:pPr>
-        <w:pStyle w:val="ListBullet"/>
+        <w:pStyle w:val="ListNumber"/>
       </w:pPr>
       <w:r>
         <w:rPr>
@@ -526,7 +786,7 @@
     </w:p>
     <w:p>
       <w:pPr>
-        <w:pStyle w:val="ListBullet"/>
+        <w:pStyle w:val="ListNumber"/>
       </w:pPr>
       <w:r>
         <w:rPr>
@@ -539,7 +799,7 @@
     </w:p>
     <w:p>
       <w:pPr>
-        <w:pStyle w:val="ListBullet"/>
+        <w:pStyle w:val="ListNumber"/>
       </w:pPr>
       <w:r>
         <w:rPr>
@@ -547,12 +807,12 @@
           <w:b w:val="0"/>
           <w:sz w:val="22"/>
         </w:rPr>
-        <w:t>Корбарлар, UserProfile ва TeacherProfile записларини бошқариш.</w:t>
+        <w:t>Корбарлар, UserProfile ва TeacherProfile ёзувларини бошқариш.</w:t>
       </w:r>
     </w:p>
     <w:p>
       <w:pPr>
-        <w:pStyle w:val="ListBullet"/>
+        <w:pStyle w:val="ListNumber"/>
       </w:pPr>
       <w:r>
         <w:rPr>
@@ -560,12 +820,12 @@
           <w:b w:val="0"/>
           <w:sz w:val="22"/>
         </w:rPr>
-        <w:t>Синфлар, фанлар, хонандалар ва омӯзгорларни қўlda тиклаш ёки тузатиш.</w:t>
+        <w:t>Синфлар, фанлар, хонандалар ва омӯзгорларни қўллаб-қувватлаш ёки тузатиш.</w:t>
       </w:r>
     </w:p>
     <w:p>
       <w:pPr>
-        <w:pStyle w:val="ListBullet"/>
+        <w:pStyle w:val="ListNumber"/>
       </w:pPr>
       <w:r>
         <w:rPr>
@@ -578,7 +838,7 @@
     </w:p>
     <w:p>
       <w:pPr>
-        <w:pStyle w:val="ListBullet"/>
+        <w:pStyle w:val="ListNumber"/>
       </w:pPr>
       <w:r>
         <w:rPr>
@@ -586,7 +846,7 @@
           <w:b w:val="0"/>
           <w:sz w:val="22"/>
         </w:rPr>
-        <w:t>Агар Maълумотлар базасида хатолик юз берса, SQLite файлини ёки захира нусхасини тиклаш.</w:t>
+        <w:t>Агар маълумотлар базасида хатолик юз берса, SQLite файлини ёки захира нусхасини тиклаш.</w:t>
       </w:r>
     </w:p>
     <w:tbl>
@@ -630,7 +890,7 @@
                 <w:color w:val="FFFFFF"/>
                 <w:sz w:val="22"/>
               </w:rPr>
-              <w:t>Бошқариш</w:t>
+              <w:t>Бошқариш имконияти</w:t>
             </w:r>
           </w:p>
         </w:tc>
@@ -662,7 +922,7 @@
                 <w:b w:val="0"/>
                 <w:sz w:val="22"/>
               </w:rPr>
-              <w:t>Муассиса маълумотлари</w:t>
+              <w:t>Муассиса номи, тури, директор, телефон</w:t>
             </w:r>
           </w:p>
         </w:tc>
@@ -694,7 +954,7 @@
                 <w:b w:val="0"/>
                 <w:sz w:val="22"/>
               </w:rPr>
-              <w:t>Корбар ҳисоб ва роллари</w:t>
+              <w:t>Логин, рамз, рол ва муассиса</w:t>
             </w:r>
           </w:p>
         </w:tc>
@@ -726,7 +986,7 @@
                 <w:b w:val="0"/>
                 <w:sz w:val="22"/>
               </w:rPr>
-              <w:t>Омӯзгор профиллари</w:t>
+              <w:t>Омӯзгор профили ва ихтисос</w:t>
             </w:r>
           </w:p>
         </w:tc>
@@ -790,7 +1050,7 @@
                 <w:b w:val="0"/>
                 <w:sz w:val="22"/>
               </w:rPr>
-              <w:t>Хонандар ва холлар</w:t>
+              <w:t>Хонандар, холлар, давомат</w:t>
             </w:r>
           </w:p>
         </w:tc>
@@ -830,13 +1090,37 @@
                 <w:b w:val="0"/>
                 <w:sz w:val="22"/>
               </w:rPr>
-              <w:t>Админ панелга фақат ваколатли шахслар кириши керак. IP фильтр ёки локал тarmoqlanish орқали мураккаблаштириш тавсия этилади.</w:t>
+              <w:t>Админ панелга фақат ваколатли шахслар кириши керак. Муҳим амаллардан олдин базани захиралаш тавсия этилади.</w:t>
             </w:r>
           </w:p>
         </w:tc>
       </w:tr>
     </w:tbl>
     <w:p/>
+    <w:p>
+      <w:pPr>
+        <w:pStyle w:val="Heading1"/>
+      </w:pPr>
+      <w:r>
+        <w:rPr>
+          <w:rFonts w:ascii="Calibri" w:hAnsi="Calibri"/>
+          <w:b/>
+          <w:color w:val="003366"/>
+          <w:sz w:val="32"/>
+        </w:rPr>
+        <w:t>4. GitHub Desktop ва deploy_to_server.py</w:t>
+      </w:r>
+    </w:p>
+    <w:p>
+      <w:r>
+        <w:rPr>
+          <w:rFonts w:ascii="Calibri" w:hAnsi="Calibri"/>
+          <w:b w:val="0"/>
+          <w:sz w:val="22"/>
+        </w:rPr>
+        <w:t>Янги шаблонлар, кўрсатмалар ёгидаги ўзгартиришларни продакшн серверга чиқариш учун GitHub Desktop ва маҳаллий deploy_to_server.py скриптидан фойдаланиш кўрсатилган.</w:t>
+      </w:r>
+    </w:p>
     <w:p>
       <w:pPr>
         <w:pStyle w:val="Heading2"/>
@@ -848,7 +1132,336 @@
           <w:color w:val="003366"/>
           <w:sz w:val="28"/>
         </w:rPr>
-        <w:t>4. Хавфсизлик ва Заҳиралаш</w:t>
+        <w:t>4.1. GitHub Desktop орқали қадамлар</w:t>
+      </w:r>
+    </w:p>
+    <w:p>
+      <w:pPr>
+        <w:pStyle w:val="ListNumber"/>
+      </w:pPr>
+      <w:r>
+        <w:rPr>
+          <w:rFonts w:ascii="Calibri" w:hAnsi="Calibri"/>
+          <w:b w:val="0"/>
+          <w:sz w:val="22"/>
+        </w:rPr>
+        <w:t>GitHub Desktop-ни очиб, Maorif_Portal лойиҳасини танланг.</w:t>
+      </w:r>
+    </w:p>
+    <w:p>
+      <w:pPr>
+        <w:pStyle w:val="ListNumber"/>
+      </w:pPr>
+      <w:r>
+        <w:rPr>
+          <w:rFonts w:ascii="Calibri" w:hAnsi="Calibri"/>
+          <w:b w:val="0"/>
+          <w:sz w:val="22"/>
+        </w:rPr>
+        <w:t>Ғайри зарур файллар (.pyc, venv) учун .gitignore мавжудлигини текширинг.</w:t>
+      </w:r>
+    </w:p>
+    <w:p>
+      <w:pPr>
+        <w:pStyle w:val="ListNumber"/>
+      </w:pPr>
+      <w:r>
+        <w:rPr>
+          <w:rFonts w:ascii="Calibri" w:hAnsi="Calibri"/>
+          <w:b w:val="0"/>
+          <w:sz w:val="22"/>
+        </w:rPr>
+        <w:t>Summary майдонида қисқа commit хабарини ёзинг.</w:t>
+      </w:r>
+    </w:p>
+    <w:p>
+      <w:pPr>
+        <w:pStyle w:val="ListNumber"/>
+      </w:pPr>
+      <w:r>
+        <w:rPr>
+          <w:rFonts w:ascii="Calibri" w:hAnsi="Calibri"/>
+          <w:b w:val="0"/>
+          <w:sz w:val="22"/>
+        </w:rPr>
+        <w:t>Commit to main тугмаси билан маҳаллий commit яратинг.</w:t>
+      </w:r>
+    </w:p>
+    <w:p>
+      <w:pPr>
+        <w:pStyle w:val="ListNumber"/>
+      </w:pPr>
+      <w:r>
+        <w:rPr>
+          <w:rFonts w:ascii="Calibri" w:hAnsi="Calibri"/>
+          <w:b w:val="0"/>
+          <w:sz w:val="22"/>
+        </w:rPr>
+        <w:t>Push origin main тугмаси билан ўзгартиришларни GitHub-га юборинг.</w:t>
+      </w:r>
+    </w:p>
+    <w:p>
+      <w:pPr>
+        <w:pStyle w:val="Heading2"/>
+      </w:pPr>
+      <w:r>
+        <w:rPr>
+          <w:rFonts w:ascii="Calibri" w:hAnsi="Calibri"/>
+          <w:b/>
+          <w:color w:val="003366"/>
+          <w:sz w:val="28"/>
+        </w:rPr>
+        <w:t>4.2. Автоматик деплой</w:t>
+      </w:r>
+    </w:p>
+    <w:p>
+      <w:pPr>
+        <w:pStyle w:val="ListNumber"/>
+      </w:pPr>
+      <w:r>
+        <w:rPr>
+          <w:rFonts w:ascii="Calibri" w:hAnsi="Calibri"/>
+          <w:b w:val="0"/>
+          <w:sz w:val="22"/>
+        </w:rPr>
+        <w:t>deploy_to_server.py скрипти маҳаллий венвда paramiko ёрдамида серверга уланади.</w:t>
+      </w:r>
+    </w:p>
+    <w:p>
+      <w:pPr>
+        <w:pStyle w:val="ListNumber"/>
+      </w:pPr>
+      <w:r>
+        <w:rPr>
+          <w:rFonts w:ascii="Calibri" w:hAnsi="Calibri"/>
+          <w:b w:val="0"/>
+          <w:sz w:val="22"/>
+        </w:rPr>
+        <w:t>Скрипт сервердаги /var/www/maorif_zafarobod/ каталогида origin/main-ни қайта чиқариб олади.</w:t>
+      </w:r>
+    </w:p>
+    <w:p>
+      <w:pPr>
+        <w:pStyle w:val="ListNumber"/>
+      </w:pPr>
+      <w:r>
+        <w:rPr>
+          <w:rFonts w:ascii="Calibri" w:hAnsi="Calibri"/>
+          <w:b w:val="0"/>
+          <w:sz w:val="22"/>
+        </w:rPr>
+        <w:t>db.sqlite3 ва schools.db файлларини захиралаб, янги кодни чиқариб, қайта тиклайди.</w:t>
+      </w:r>
+    </w:p>
+    <w:p>
+      <w:pPr>
+        <w:pStyle w:val="ListNumber"/>
+      </w:pPr>
+      <w:r>
+        <w:rPr>
+          <w:rFonts w:ascii="Calibri" w:hAnsi="Calibri"/>
+          <w:b w:val="0"/>
+          <w:sz w:val="22"/>
+        </w:rPr>
+        <w:t>python manage.py migrate, Gunicorn ва Nginx-ни қайта ишга туширади.</w:t>
+      </w:r>
+    </w:p>
+    <w:tbl>
+      <w:tblPr>
+        <w:tblStyle w:val="TableGrid"/>
+        <w:tblW w:type="auto" w:w="0"/>
+        <w:tblLook w:firstColumn="1" w:firstRow="1" w:lastColumn="0" w:lastRow="0" w:noHBand="0" w:noVBand="1" w:val="04A0"/>
+      </w:tblPr>
+      <w:tblGrid>
+        <w:gridCol w:w="4320"/>
+        <w:gridCol w:w="4320"/>
+      </w:tblGrid>
+      <w:tr>
+        <w:tc>
+          <w:tcPr>
+            <w:tcW w:type="dxa" w:w="4320"/>
+            <w:shd w:fill="003366"/>
+          </w:tcPr>
+          <w:p>
+            <w:r>
+              <w:rPr>
+                <w:rFonts w:ascii="Calibri" w:hAnsi="Calibri"/>
+                <w:b/>
+                <w:color w:val="FFFFFF"/>
+                <w:sz w:val="22"/>
+              </w:rPr>
+              <w:t>Файл</w:t>
+            </w:r>
+          </w:p>
+        </w:tc>
+        <w:tc>
+          <w:tcPr>
+            <w:tcW w:type="dxa" w:w="4320"/>
+            <w:shd w:fill="003366"/>
+          </w:tcPr>
+          <w:p>
+            <w:r>
+              <w:rPr>
+                <w:rFonts w:ascii="Calibri" w:hAnsi="Calibri"/>
+                <w:b/>
+                <w:color w:val="FFFFFF"/>
+                <w:sz w:val="22"/>
+              </w:rPr>
+              <w:t>Вазифаси</w:t>
+            </w:r>
+          </w:p>
+        </w:tc>
+      </w:tr>
+      <w:tr>
+        <w:tc>
+          <w:tcPr>
+            <w:tcW w:type="dxa" w:w="4320"/>
+          </w:tcPr>
+          <w:p>
+            <w:r>
+              <w:rPr>
+                <w:rFonts w:ascii="Calibri" w:hAnsi="Calibri"/>
+                <w:b w:val="0"/>
+                <w:sz w:val="22"/>
+              </w:rPr>
+              <w:t>.gitignore</w:t>
+            </w:r>
+          </w:p>
+        </w:tc>
+        <w:tc>
+          <w:tcPr>
+            <w:tcW w:type="dxa" w:w="4320"/>
+          </w:tcPr>
+          <w:p>
+            <w:r>
+              <w:rPr>
+                <w:rFonts w:ascii="Calibri" w:hAnsi="Calibri"/>
+                <w:b w:val="0"/>
+                <w:sz w:val="22"/>
+              </w:rPr>
+              <w:t>venv ва __pycache__ гитда сақланмаслиги учун</w:t>
+            </w:r>
+          </w:p>
+        </w:tc>
+      </w:tr>
+      <w:tr>
+        <w:tc>
+          <w:tcPr>
+            <w:tcW w:type="dxa" w:w="4320"/>
+          </w:tcPr>
+          <w:p>
+            <w:r>
+              <w:rPr>
+                <w:rFonts w:ascii="Calibri" w:hAnsi="Calibri"/>
+                <w:b w:val="0"/>
+                <w:sz w:val="22"/>
+              </w:rPr>
+              <w:t>deploy_to_server.py</w:t>
+            </w:r>
+          </w:p>
+        </w:tc>
+        <w:tc>
+          <w:tcPr>
+            <w:tcW w:type="dxa" w:w="4320"/>
+          </w:tcPr>
+          <w:p>
+            <w:r>
+              <w:rPr>
+                <w:rFonts w:ascii="Calibri" w:hAnsi="Calibri"/>
+                <w:b w:val="0"/>
+                <w:sz w:val="22"/>
+              </w:rPr>
+              <w:t>SSH орқали автоматик продакшн янгилаш</w:t>
+            </w:r>
+          </w:p>
+        </w:tc>
+      </w:tr>
+      <w:tr>
+        <w:tc>
+          <w:tcPr>
+            <w:tcW w:type="dxa" w:w="4320"/>
+          </w:tcPr>
+          <w:p>
+            <w:r>
+              <w:rPr>
+                <w:rFonts w:ascii="Calibri" w:hAnsi="Calibri"/>
+                <w:b w:val="0"/>
+                <w:sz w:val="22"/>
+              </w:rPr>
+              <w:t>generate_manuals.py</w:t>
+            </w:r>
+          </w:p>
+        </w:tc>
+        <w:tc>
+          <w:tcPr>
+            <w:tcW w:type="dxa" w:w="4320"/>
+          </w:tcPr>
+          <w:p>
+            <w:r>
+              <w:rPr>
+                <w:rFonts w:ascii="Calibri" w:hAnsi="Calibri"/>
+                <w:b w:val="0"/>
+                <w:sz w:val="22"/>
+              </w:rPr>
+              <w:t>Кўрсатма .docx ҳужжатларини яратиш</w:t>
+            </w:r>
+          </w:p>
+        </w:tc>
+      </w:tr>
+    </w:tbl>
+    <w:p/>
+    <w:tbl>
+      <w:tblPr>
+        <w:tblW w:type="auto" w:w="0"/>
+        <w:tblLayout w:type="fixed"/>
+        <w:tblLook w:firstColumn="1" w:firstRow="1" w:lastColumn="0" w:lastRow="0" w:noHBand="0" w:noVBand="1" w:val="04A0"/>
+      </w:tblPr>
+      <w:tblGrid>
+        <w:gridCol w:w="8640"/>
+      </w:tblGrid>
+      <w:tr>
+        <w:tc>
+          <w:tcPr>
+            <w:tcW w:type="dxa" w:w="8640"/>
+            <w:shd w:fill="FFF3CD"/>
+          </w:tcPr>
+          <w:p>
+            <w:r>
+              <w:rPr>
+                <w:rFonts w:ascii="Calibri" w:hAnsi="Calibri"/>
+                <w:b/>
+                <w:color w:val="856404"/>
+                <w:sz w:val="22"/>
+              </w:rPr>
+              <w:t>Эслатма:</w:t>
+            </w:r>
+          </w:p>
+          <w:p>
+            <w:r>
+              <w:rPr>
+                <w:rFonts w:ascii="Calibri" w:hAnsi="Calibri"/>
+                <w:b w:val="0"/>
+                <w:sz w:val="22"/>
+              </w:rPr>
+              <w:t>deploy_to_server.py паролни getpass билан қабул қилади. SSH_PASSWORD ёки REPO_URL муҳит ўзгарувчилари орқали автоматлаштириш мумкин.</w:t>
+            </w:r>
+          </w:p>
+        </w:tc>
+      </w:tr>
+    </w:tbl>
+    <w:p/>
+    <w:p>
+      <w:pPr>
+        <w:pStyle w:val="Heading1"/>
+      </w:pPr>
+      <w:r>
+        <w:rPr>
+          <w:rFonts w:ascii="Calibri" w:hAnsi="Calibri"/>
+          <w:b/>
+          <w:color w:val="003366"/>
+          <w:sz w:val="32"/>
+        </w:rPr>
+        <w:t>5. Хавфсизлик ва Заҳиралаш</w:t>
       </w:r>
     </w:p>
     <w:p>
@@ -858,7 +1471,7 @@
           <w:b w:val="0"/>
           <w:sz w:val="22"/>
         </w:rPr>
-        <w:t>Лойиҳа файларини GitHub Desktop ёки Git буйруқлари орқали таққослаш ва захиралаш зарур:</w:t>
+        <w:t>Лойиҳа файларини вақти-вақти билан таққослаш ва захиралаш зарур.</w:t>
       </w:r>
     </w:p>
     <w:p>
@@ -884,7 +1497,7 @@
           <w:b w:val="0"/>
           <w:sz w:val="22"/>
         </w:rPr>
-        <w:t>Loyiҳа каталогида `git status` натижасини кўриб, ўзгартирилган файлларни тасдиқланг.</w:t>
+        <w:t>Loyiҳа каталогида git status натижасини кўриб, ўзгартирилган файлларни тасдиқланг.</w:t>
       </w:r>
     </w:p>
     <w:p>
@@ -897,33 +1510,7 @@
           <w:b w:val="0"/>
           <w:sz w:val="22"/>
         </w:rPr>
-        <w:t>Har bir muhim ўзгаришдан кейин commit қилинг. Масалан: "Yangi shablon va manual qo'shildi".</w:t>
-      </w:r>
-    </w:p>
-    <w:p>
-      <w:pPr>
-        <w:pStyle w:val="ListBullet"/>
-      </w:pPr>
-      <w:r>
-        <w:rPr>
-          <w:rFonts w:ascii="Calibri" w:hAnsi="Calibri"/>
-          <w:b w:val="0"/>
-          <w:sz w:val="22"/>
-        </w:rPr>
-        <w:t>Commit xabarларида нима ва нега ўзгартирилганлиги кўрсатилсин.</w:t>
-      </w:r>
-    </w:p>
-    <w:p>
-      <w:pPr>
-        <w:pStyle w:val="ListBullet"/>
-      </w:pPr>
-      <w:r>
-        <w:rPr>
-          <w:rFonts w:ascii="Calibri" w:hAnsi="Calibri"/>
-          <w:b w:val="0"/>
-          <w:sz w:val="22"/>
-        </w:rPr>
-        <w:t>Push тугмаси ёки `git push` орқали масофавий захира (remote repository) га юборинг.</w:t>
+        <w:t>Ҳар бир муҳим ўзгаришдан кейин commit қилинг.</w:t>
       </w:r>
     </w:p>
     <w:p>
@@ -937,6 +1524,19 @@
           <w:sz w:val="22"/>
         </w:rPr>
         <w:t>db.sqlite3, schools.db ва media каталогини ҳам вақти-вақти билан нусха олиб туриш тавсия этилади.</w:t>
+      </w:r>
+    </w:p>
+    <w:p>
+      <w:pPr>
+        <w:pStyle w:val="ListBullet"/>
+      </w:pPr>
+      <w:r>
+        <w:rPr>
+          <w:rFonts w:ascii="Calibri" w:hAnsi="Calibri"/>
+          <w:b w:val="0"/>
+          <w:sz w:val="22"/>
+        </w:rPr>
+        <w:t>Сирли маълумотлар (пароллар, калитлар) гитга тарқалмаслиги учун .gitignore файлини текширинг.</w:t>
       </w:r>
     </w:p>
     <w:tbl>
@@ -1113,6 +1713,38 @@
           </w:p>
         </w:tc>
       </w:tr>
+      <w:tr>
+        <w:tc>
+          <w:tcPr>
+            <w:tcW w:type="dxa" w:w="4320"/>
+          </w:tcPr>
+          <w:p>
+            <w:r>
+              <w:rPr>
+                <w:rFonts w:ascii="Calibri" w:hAnsi="Calibri"/>
+                <w:b w:val="0"/>
+                <w:sz w:val="22"/>
+              </w:rPr>
+              <w:t>Деплой</w:t>
+            </w:r>
+          </w:p>
+        </w:tc>
+        <w:tc>
+          <w:tcPr>
+            <w:tcW w:type="dxa" w:w="4320"/>
+          </w:tcPr>
+          <w:p>
+            <w:r>
+              <w:rPr>
+                <w:rFonts w:ascii="Calibri" w:hAnsi="Calibri"/>
+                <w:b w:val="0"/>
+                <w:sz w:val="22"/>
+              </w:rPr>
+              <w:t>python deploy_to_server.py</w:t>
+            </w:r>
+          </w:p>
+        </w:tc>
+      </w:tr>
     </w:tbl>
     <w:p/>
     <w:tbl>
@@ -1148,7 +1780,7 @@
                 <w:b w:val="0"/>
                 <w:sz w:val="22"/>
               </w:rPr>
-              <w:t>Сирли маълумотлар (пароллар, калитлар) гитга тарқалмаслиги учун `.gitignore` файлини текширинг.</w:t>
+              <w:t>Сирли маълумотлар (пароллар, калитлар) гитга тарқалмаслиги учун .gitignore файлини текширинг.</w:t>
             </w:r>
           </w:p>
         </w:tc>

</xml_diff>